<commit_message>
Fix lab6 report template formatting
AI-Co-Authored-By: Codex
</commit_message>
<xml_diff>
--- a/LAB6/22920242203267_李富悦_实验6.docx
+++ b/LAB6/22920242203267_李富悦_实验6.docx
@@ -2,111 +2,355 @@
 <file path=word/document.xml><?xml version="1.0" encoding="utf-8"?>
 <w:document xmlns:wpc="http://schemas.microsoft.com/office/word/2010/wordprocessingCanvas" xmlns:cx="http://schemas.microsoft.com/office/drawing/2014/chartex" xmlns:cx1="http://schemas.microsoft.com/office/drawing/2015/9/8/chartex" xmlns:cx2="http://schemas.microsoft.com/office/drawing/2015/10/21/chartex" xmlns:cx3="http://schemas.microsoft.com/office/drawing/2016/5/9/chartex" xmlns:cx4="http://schemas.microsoft.com/office/drawing/2016/5/10/chartex" xmlns:cx5="http://schemas.microsoft.com/office/drawing/2016/5/11/chartex" xmlns:cx6="http://schemas.microsoft.com/office/drawing/2016/5/12/chartex" xmlns:cx7="http://schemas.microsoft.com/office/drawing/2016/5/13/chartex" xmlns:cx8="http://schemas.microsoft.com/office/drawing/2016/5/14/chartex" xmlns:mc="http://schemas.openxmlformats.org/markup-compatibility/2006" xmlns:aink="http://schemas.microsoft.com/office/drawing/2016/ink" xmlns:am3d="http://schemas.microsoft.com/office/drawing/2017/model3d" xmlns:o="urn:schemas-microsoft-com:office:office" xmlns:oel="http://schemas.microsoft.com/office/2019/extlst" xmlns:r="http://schemas.openxmlformats.org/officeDocument/2006/relationships" xmlns:m="http://schemas.openxmlformats.org/officeDocument/2006/math" xmlns:v="urn:schemas-microsoft-com:vml" xmlns:wp14="http://schemas.microsoft.com/office/word/2010/wordprocessingDrawing" xmlns:wp="http://schemas.openxmlformats.org/drawingml/2006/wordprocessingDrawing" xmlns:w10="urn:schemas-microsoft-com:office:word" xmlns:w="http://schemas.openxmlformats.org/wordprocessingml/2006/main" xmlns:w14="http://schemas.microsoft.com/office/word/2010/wordml" xmlns:w15="http://schemas.microsoft.com/office/word/2012/wordml" xmlns:w16cex="http://schemas.microsoft.com/office/word/2018/wordml/cex" xmlns:w16cid="http://schemas.microsoft.com/office/word/2016/wordml/cid" xmlns:w16="http://schemas.microsoft.com/office/word/2018/wordml" xmlns:w16sdtdh="http://schemas.microsoft.com/office/word/2020/wordml/sdtdatahash" xmlns:w16se="http://schemas.microsoft.com/office/word/2015/wordml/symex" xmlns:wpg="http://schemas.microsoft.com/office/word/2010/wordprocessingGroup" xmlns:wpi="http://schemas.microsoft.com/office/word/2010/wordprocessingInk" xmlns:wne="http://schemas.microsoft.com/office/word/2006/wordml" xmlns:wps="http://schemas.microsoft.com/office/word/2010/wordprocessingShape" mc:Ignorable="w14 w15 w16se w16cid w16 w16cex w16sdtdh wp14">
   <w:body>
-    <w:p/>
-    <w:p/>
-    <w:p/>
-    <w:p>
-      <w:pPr>
-        <w:spacing w:before="0" w:after="320" w:line="269" w:lineRule="auto"/>
+    <w:p>
+      <w:pPr>
+        <w:spacing w:after="120"/>
+      </w:pPr>
+      <w:r>
+        <w:rPr>
+          <w:rFonts w:ascii="Times New Roman" w:eastAsia="Times New Roman" w:hAnsi="Times New Roman" w:cs="Times New Roman"/>
+          <w:b/>
+          <w:sz w:val="28"/>
+        </w:rPr>
+        <w:t xml:space="preserve"> </w:t>
+      </w:r>
+    </w:p>
+    <w:p>
+      <w:pPr>
+        <w:spacing w:after="81"/>
+        <w:ind w:left="7"/>
         <w:jc w:val="center"/>
       </w:pPr>
       <w:r>
         <w:rPr>
+          <w:noProof/>
+        </w:rPr>
+        <w:drawing>
+          <wp:inline distT="0" distB="0" distL="0" distR="0" wp14:anchorId="06F07788" wp14:editId="52264517">
+            <wp:extent cx="2085975" cy="571500"/>
+            <wp:effectExtent l="0" t="0" r="0" b="0"/>
+            <wp:docPr id="83" name="Picture 83"/>
+            <wp:cNvGraphicFramePr/>
+            <a:graphic xmlns:a="http://schemas.openxmlformats.org/drawingml/2006/main">
+              <a:graphicData uri="http://schemas.openxmlformats.org/drawingml/2006/picture">
+                <pic:pic xmlns:pic="http://schemas.openxmlformats.org/drawingml/2006/picture">
+                  <pic:nvPicPr>
+                    <pic:cNvPr id="83" name="Picture 83"/>
+                    <pic:cNvPicPr/>
+                  </pic:nvPicPr>
+                  <pic:blipFill>
+                    <a:blip r:embed="rId7"/>
+                    <a:stretch>
+                      <a:fillRect/>
+                    </a:stretch>
+                  </pic:blipFill>
+                  <pic:spPr>
+                    <a:xfrm>
+                      <a:off x="0" y="0"/>
+                      <a:ext cx="2085975" cy="571500"/>
+                    </a:xfrm>
+                    <a:prstGeom prst="rect">
+                      <a:avLst/>
+                    </a:prstGeom>
+                  </pic:spPr>
+                </pic:pic>
+              </a:graphicData>
+            </a:graphic>
+          </wp:inline>
+        </w:drawing>
+      </w:r>
+      <w:r>
+        <w:rPr>
+          <w:rFonts w:ascii="Times New Roman" w:eastAsia="Times New Roman" w:hAnsi="Times New Roman" w:cs="Times New Roman"/>
+          <w:b/>
+          <w:sz w:val="28"/>
+        </w:rPr>
+        <w:t xml:space="preserve"> </w:t>
+      </w:r>
+    </w:p>
+    <w:p>
+      <w:pPr>
+        <w:spacing w:after="360"/>
+      </w:pPr>
+      <w:r>
+        <w:rPr>
+          <w:rFonts w:ascii="Times New Roman" w:eastAsia="Times New Roman" w:hAnsi="Times New Roman" w:cs="Times New Roman"/>
+          <w:sz w:val="24"/>
+        </w:rPr>
+        <w:t xml:space="preserve"> </w:t>
+      </w:r>
+    </w:p>
+    <w:p>
+      <w:pPr>
+        <w:spacing w:after="1" w:line="262" w:lineRule="auto"/>
+        <w:jc w:val="center"/>
+        <w:rPr>
+          <w:rFonts w:ascii="黑体" w:eastAsia="黑体" w:hAnsi="黑体" w:cs="宋体"/>
+          <w:sz w:val="52"/>
+          <w:szCs w:val="52"/>
+        </w:rPr>
+      </w:pPr>
+      <w:r>
+        <w:rPr>
+          <w:rFonts w:ascii="黑体" w:eastAsia="黑体" w:hAnsi="黑体" w:cs="宋体" w:hint="eastAsia"/>
+          <w:sz w:val="52"/>
+          <w:szCs w:val="52"/>
+        </w:rPr>
+        <w:t>计算机图形学实验</w:t>
+      </w:r>
+    </w:p>
+    <w:p>
+      <w:pPr>
+        <w:spacing w:after="175"/>
+        <w:rPr>
+          <w:rFonts w:ascii="宋体" w:eastAsia="宋体" w:hAnsi="宋体" w:cs="宋体"/>
+          <w:sz w:val="32"/>
+        </w:rPr>
+      </w:pPr>
+    </w:p>
+    <w:p>
+      <w:pPr>
+        <w:spacing w:after="0"/>
+        <w:jc w:val="center"/>
+        <w:rPr>
+          <w:rFonts w:eastAsiaTheme="minorEastAsia"/>
+        </w:rPr>
+      </w:pPr>
+      <w:r>
+        <w:rPr>
+          <w:rFonts w:ascii="Calibri" w:hAnsi="Calibri" w:eastAsia="黑体"/>
+          <w:b/>
+          <w:sz w:val="44"/>
+        </w:rPr>
+        <w:t>实验6、Ray Tracing 光线跟踪</w:t>
+      </w:r>
+    </w:p>
+    <w:p>
+      <w:pPr>
+        <w:spacing w:after="175"/>
+      </w:pPr>
+      <w:r>
+        <w:rPr>
+          <w:rFonts w:ascii="宋体" w:eastAsia="宋体" w:hAnsi="宋体" w:cs="宋体"/>
+          <w:sz w:val="32"/>
+        </w:rPr>
+        <w:t xml:space="preserve"> </w:t>
+      </w:r>
+    </w:p>
+    <w:p>
+      <w:pPr>
+        <w:spacing w:after="175"/>
+      </w:pPr>
+      <w:r>
+        <w:rPr>
+          <w:rFonts w:ascii="宋体" w:eastAsia="宋体" w:hAnsi="宋体" w:cs="宋体"/>
+          <w:sz w:val="32"/>
+        </w:rPr>
+        <w:t xml:space="preserve"> </w:t>
+      </w:r>
+    </w:p>
+    <w:p>
+      <w:pPr>
+        <w:jc w:val="center"/>
+        <w:rPr>
+          <w:rFonts w:ascii="宋体" w:eastAsia="宋体" w:hAnsi="宋体"/>
+          <w:sz w:val="32"/>
+          <w:szCs w:val="32"/>
+        </w:rPr>
+      </w:pPr>
+      <w:r>
+        <w:rPr>
+          <w:rFonts w:ascii="Calibri" w:hAnsi="Calibri" w:eastAsia="黑体"/>
+          <w:b/>
+          <w:sz w:val="30"/>
+        </w:rPr>
+        <w:t>姓    名：李富悦</w:t>
+      </w:r>
+    </w:p>
+    <w:p>
+      <w:pPr>
+        <w:jc w:val="center"/>
+        <w:rPr>
+          <w:rFonts w:ascii="宋体" w:eastAsia="宋体" w:hAnsi="宋体"/>
+          <w:sz w:val="32"/>
+          <w:szCs w:val="32"/>
+        </w:rPr>
+      </w:pPr>
+      <w:r>
+        <w:rPr>
+          <w:rFonts w:ascii="Calibri" w:hAnsi="Calibri" w:eastAsia="黑体"/>
+          <w:b/>
+          <w:sz w:val="30"/>
+        </w:rPr>
+        <w:t>学    号：22920242203267</w:t>
+      </w:r>
+    </w:p>
+    <w:p>
+      <w:pPr>
+        <w:jc w:val="center"/>
+        <w:rPr>
+          <w:rFonts w:ascii="宋体" w:eastAsia="宋体" w:hAnsi="宋体"/>
+          <w:sz w:val="32"/>
+          <w:szCs w:val="32"/>
+        </w:rPr>
+      </w:pPr>
+      <w:r>
+        <w:rPr>
+          <w:rFonts w:ascii="Calibri" w:hAnsi="Calibri" w:eastAsia="黑体"/>
+          <w:b/>
+          <w:sz w:val="30"/>
+        </w:rPr>
+        <w:t>学    院：信息学院</w:t>
+      </w:r>
+    </w:p>
+    <w:p>
+      <w:pPr>
+        <w:jc w:val="center"/>
+        <w:rPr>
+          <w:rFonts w:ascii="宋体" w:eastAsia="宋体" w:hAnsi="宋体"/>
+          <w:sz w:val="32"/>
+          <w:szCs w:val="32"/>
+        </w:rPr>
+      </w:pPr>
+      <w:r>
+        <w:rPr>
+          <w:rFonts w:ascii="Calibri" w:hAnsi="Calibri" w:eastAsia="黑体"/>
+          <w:b/>
+          <w:sz w:val="30"/>
+        </w:rPr>
+        <w:t>专    业：软件工程</w:t>
+      </w:r>
+    </w:p>
+    <w:p>
+      <w:pPr>
+        <w:jc w:val="center"/>
+        <w:rPr>
+          <w:rFonts w:ascii="宋体" w:eastAsia="宋体" w:hAnsi="宋体"/>
+          <w:sz w:val="32"/>
+          <w:szCs w:val="32"/>
+        </w:rPr>
+      </w:pPr>
+      <w:r>
+        <w:rPr>
+          <w:rFonts w:ascii="Calibri" w:hAnsi="Calibri" w:eastAsia="黑体"/>
+          <w:b/>
+          <w:sz w:val="30"/>
+        </w:rPr>
+        <w:t>年    级：大二</w:t>
+      </w:r>
+    </w:p>
+    <w:p>
+      <w:pPr>
+        <w:spacing w:after="0" w:line="192" w:lineRule="auto"/>
+        <w:ind w:left="2125"/>
+        <w:rPr>
+          <w:rFonts w:eastAsiaTheme="minorEastAsia"/>
+        </w:rPr>
+      </w:pPr>
+      <w:r>
+        <w:rPr>
+          <w:rFonts w:ascii="宋体" w:eastAsia="宋体" w:hAnsi="宋体" w:cs="宋体"/>
+          <w:sz w:val="32"/>
+        </w:rPr>
+        <w:t xml:space="preserve"> </w:t>
+      </w:r>
+    </w:p>
+    <w:p>
+      <w:pPr>
+        <w:spacing w:after="0" w:line="192" w:lineRule="auto"/>
+        <w:ind w:left="2125"/>
+      </w:pPr>
+      <w:r>
+        <w:rPr>
+          <w:rFonts w:ascii="宋体" w:eastAsia="宋体" w:hAnsi="宋体" w:cs="宋体"/>
+          <w:sz w:val="32"/>
+        </w:rPr>
+        <w:t xml:space="preserve"> </w:t>
+      </w:r>
+    </w:p>
+    <w:p>
+      <w:pPr>
+        <w:spacing w:after="0" w:line="192" w:lineRule="auto"/>
+        <w:ind w:right="480"/>
+        <w:jc w:val="center"/>
+        <w:rPr>
+          <w:rFonts w:ascii="Times New Roman" w:eastAsia="Times New Roman" w:hAnsi="Times New Roman" w:cs="Times New Roman"/>
+          <w:b/>
+          <w:sz w:val="28"/>
+        </w:rPr>
+      </w:pPr>
+    </w:p>
+    <w:p>
+      <w:pPr>
+        <w:spacing w:after="0" w:line="192" w:lineRule="auto"/>
+        <w:ind w:right="480"/>
+        <w:jc w:val="center"/>
+        <w:rPr>
+          <w:rFonts w:ascii="Times New Roman" w:eastAsiaTheme="minorEastAsia" w:hAnsi="Times New Roman" w:cs="Times New Roman"/>
+          <w:b/>
+          <w:sz w:val="28"/>
+        </w:rPr>
+      </w:pPr>
+    </w:p>
+    <w:p>
+      <w:pPr>
+        <w:spacing w:after="0" w:line="192" w:lineRule="auto"/>
+        <w:ind w:right="480"/>
+        <w:jc w:val="center"/>
+        <w:rPr>
+          <w:rFonts w:ascii="Times New Roman" w:eastAsiaTheme="minorEastAsia" w:hAnsi="Times New Roman" w:cs="Times New Roman"/>
+          <w:b/>
+          <w:sz w:val="28"/>
+        </w:rPr>
+      </w:pPr>
+    </w:p>
+    <w:p>
+      <w:pPr>
+        <w:spacing w:after="0" w:line="192" w:lineRule="auto"/>
+        <w:ind w:right="480"/>
+        <w:jc w:val="center"/>
+        <w:rPr>
+          <w:rFonts w:ascii="Times New Roman" w:eastAsiaTheme="minorEastAsia" w:hAnsi="Times New Roman" w:cs="Times New Roman"/>
+          <w:b/>
+          <w:sz w:val="28"/>
+        </w:rPr>
+      </w:pPr>
+    </w:p>
+    <w:p>
+      <w:pPr>
+        <w:spacing w:after="316"/>
+        <w:jc w:val="center"/>
+      </w:pPr>
+      <w:r>
+        <w:rPr>
           <w:rFonts w:ascii="Calibri" w:hAnsi="Calibri" w:eastAsia="宋体"/>
-          <w:b/>
+          <w:sz w:val="28"/>
+        </w:rPr>
+        <w:t>2026年5月25日</w:t>
+      </w:r>
+    </w:p>
+    <w:p>
+      <w:r>
+        <w:br w:type="page"/>
+      </w:r>
+    </w:p>
+    <w:p>
+      <w:pPr>
+        <w:spacing w:before="0" w:after="280" w:line="276" w:lineRule="auto"/>
+      </w:pPr>
+      <w:r>
+        <w:rPr>
+          <w:rFonts w:ascii="Calibri" w:hAnsi="Calibri" w:eastAsia="宋体"/>
+          <w:b w:val="0"/>
+          <w:color w:val="4472C4"/>
           <w:sz w:val="36"/>
         </w:rPr>
-        <w:t>计算机图形学实验</w:t>
-      </w:r>
-    </w:p>
-    <w:p>
-      <w:pPr>
-        <w:spacing w:before="0" w:after="480" w:line="269" w:lineRule="auto"/>
-        <w:jc w:val="center"/>
-      </w:pPr>
-      <w:r>
-        <w:rPr>
-          <w:rFonts w:ascii="Calibri" w:hAnsi="Calibri" w:eastAsia="宋体"/>
-          <w:b/>
-          <w:sz w:val="32"/>
-        </w:rPr>
-        <w:t>实验6、Ray Tracing 光线跟踪</w:t>
-      </w:r>
-    </w:p>
-    <w:p>
-      <w:pPr>
-        <w:spacing w:before="0" w:after="80" w:line="269" w:lineRule="auto"/>
-        <w:jc w:val="center"/>
-      </w:pPr>
-      <w:r>
-        <w:rPr>
-          <w:rFonts w:ascii="Calibri" w:hAnsi="Calibri" w:eastAsia="宋体"/>
-          <w:sz w:val="24"/>
-        </w:rPr>
-        <w:t>姓    名：李富悦</w:t>
-      </w:r>
-    </w:p>
-    <w:p>
-      <w:pPr>
-        <w:spacing w:before="0" w:after="80" w:line="269" w:lineRule="auto"/>
-        <w:jc w:val="center"/>
-      </w:pPr>
-      <w:r>
-        <w:rPr>
-          <w:rFonts w:ascii="Calibri" w:hAnsi="Calibri" w:eastAsia="宋体"/>
-          <w:sz w:val="24"/>
-        </w:rPr>
-        <w:t>学    号：22920242203267</w:t>
-      </w:r>
-    </w:p>
-    <w:p>
-      <w:pPr>
-        <w:spacing w:before="0" w:after="80" w:line="269" w:lineRule="auto"/>
-        <w:jc w:val="center"/>
-      </w:pPr>
-      <w:r>
-        <w:rPr>
-          <w:rFonts w:ascii="Calibri" w:hAnsi="Calibri" w:eastAsia="宋体"/>
-          <w:sz w:val="24"/>
-        </w:rPr>
-        <w:t>学    院：信息学院</w:t>
-      </w:r>
-    </w:p>
-    <w:p>
-      <w:pPr>
-        <w:spacing w:before="0" w:after="80" w:line="269" w:lineRule="auto"/>
-        <w:jc w:val="center"/>
-      </w:pPr>
-      <w:r>
-        <w:rPr>
-          <w:rFonts w:ascii="Calibri" w:hAnsi="Calibri" w:eastAsia="宋体"/>
-          <w:sz w:val="24"/>
-        </w:rPr>
-        <w:t>专    业：软件工程</w:t>
-      </w:r>
-    </w:p>
-    <w:p>
-      <w:pPr>
-        <w:spacing w:before="0" w:after="80" w:line="269" w:lineRule="auto"/>
-        <w:jc w:val="center"/>
-      </w:pPr>
-      <w:r>
-        <w:rPr>
-          <w:rFonts w:ascii="Calibri" w:hAnsi="Calibri" w:eastAsia="宋体"/>
-          <w:sz w:val="24"/>
-        </w:rPr>
-        <w:t>年    级：大二</w:t>
-      </w:r>
-    </w:p>
-    <w:p/>
-    <w:p/>
-    <w:p/>
-    <w:p/>
-    <w:p/>
-    <w:p>
-      <w:pPr>
-        <w:spacing w:before="0" w:after="0" w:line="269" w:lineRule="auto"/>
-        <w:jc w:val="center"/>
+        <w:t>目录</w:t>
+      </w:r>
+    </w:p>
+    <w:p>
+      <w:pPr>
+        <w:spacing w:before="0" w:after="160" w:line="276" w:lineRule="auto"/>
       </w:pPr>
       <w:r>
         <w:rPr>
@@ -114,169 +358,249 @@
           <w:b w:val="0"/>
           <w:sz w:val="24"/>
         </w:rPr>
-        <w:t>2026年5月25日</w:t>
-      </w:r>
-    </w:p>
-    <w:p>
+        <w:t>Task1：Whitted Style 光线跟踪程序........................................3</w:t>
+      </w:r>
+    </w:p>
+    <w:p>
+      <w:pPr>
+        <w:spacing w:before="0" w:after="120" w:line="276" w:lineRule="auto"/>
+      </w:pPr>
       <w:r>
         <w:rPr>
           <w:rFonts w:ascii="Calibri" w:hAnsi="Calibri" w:eastAsia="宋体"/>
-          <w:sz w:val="22"/>
-        </w:rPr>
+          <w:b w:val="0"/>
+          <w:sz w:val="24"/>
+        </w:rPr>
+        <w:t xml:space="preserve">    1. 光线生成........................................................3</w:t>
+      </w:r>
+    </w:p>
+    <w:p>
+      <w:pPr>
+        <w:spacing w:before="0" w:after="120" w:line="276" w:lineRule="auto"/>
+      </w:pPr>
+      <w:r>
+        <w:rPr>
+          <w:rFonts w:ascii="Calibri" w:hAnsi="Calibri" w:eastAsia="宋体"/>
+          <w:b w:val="0"/>
+          <w:sz w:val="24"/>
+        </w:rPr>
+        <w:t xml:space="preserve">    2. 阴影判断........................................................3</w:t>
+      </w:r>
+    </w:p>
+    <w:p>
+      <w:pPr>
+        <w:spacing w:before="0" w:after="120" w:line="276" w:lineRule="auto"/>
+      </w:pPr>
+      <w:r>
+        <w:rPr>
+          <w:rFonts w:ascii="Calibri" w:hAnsi="Calibri" w:eastAsia="宋体"/>
+          <w:b w:val="0"/>
+          <w:sz w:val="24"/>
+        </w:rPr>
+        <w:t xml:space="preserve">    3. 镜面反射........................................................4</w:t>
+      </w:r>
+    </w:p>
+    <w:p>
+      <w:pPr>
+        <w:spacing w:before="0" w:after="120" w:line="276" w:lineRule="auto"/>
+      </w:pPr>
+      <w:r>
+        <w:rPr>
+          <w:rFonts w:ascii="Calibri" w:hAnsi="Calibri" w:eastAsia="宋体"/>
+          <w:b w:val="0"/>
+          <w:sz w:val="24"/>
+        </w:rPr>
+        <w:t xml:space="preserve">    4. 折射效果........................................................4</w:t>
+      </w:r>
+    </w:p>
+    <w:p>
+      <w:r>
         <w:br w:type="page"/>
       </w:r>
     </w:p>
     <w:p>
       <w:pPr>
-        <w:spacing w:before="200" w:after="120" w:line="269" w:lineRule="auto"/>
+        <w:spacing w:before="160" w:after="360" w:line="276" w:lineRule="auto"/>
+        <w:jc w:val="center"/>
+      </w:pPr>
+      <w:r>
+        <w:rPr>
+          <w:rFonts w:ascii="Calibri" w:hAnsi="Calibri" w:eastAsia="黑体"/>
+          <w:b/>
+          <w:sz w:val="36"/>
+        </w:rPr>
+        <w:t>Task1：Whitted Style 光线跟踪程序</w:t>
+      </w:r>
+    </w:p>
+    <w:p>
+      <w:pPr>
+        <w:spacing w:before="200" w:after="200" w:line="276" w:lineRule="auto"/>
+      </w:pPr>
+      <w:r>
+        <w:rPr>
+          <w:rFonts w:ascii="Calibri" w:hAnsi="Calibri" w:eastAsia="黑体"/>
+          <w:b/>
+          <w:sz w:val="30"/>
+        </w:rPr>
+        <w:t>1. 光线生成</w:t>
+      </w:r>
+    </w:p>
+    <w:p>
+      <w:pPr>
+        <w:spacing w:before="0" w:after="80" w:line="276" w:lineRule="auto"/>
       </w:pPr>
       <w:r>
         <w:rPr>
           <w:rFonts w:ascii="Calibri" w:hAnsi="Calibri" w:eastAsia="宋体"/>
           <w:b/>
-          <w:color w:val="1F4D78"/>
-          <w:sz w:val="28"/>
-        </w:rPr>
-        <w:t>一、实验目的</w:t>
-      </w:r>
-    </w:p>
-    <w:p>
-      <w:pPr>
-        <w:spacing w:before="0" w:after="120" w:line="269" w:lineRule="auto"/>
-        <w:ind w:firstLine="418"/>
+          <w:sz w:val="24"/>
+        </w:rPr>
+        <w:t>操作流程：</w:t>
+      </w:r>
+    </w:p>
+    <w:p>
+      <w:pPr>
+        <w:spacing w:before="0" w:after="160" w:line="276" w:lineRule="auto"/>
+        <w:ind w:firstLine="403"/>
       </w:pPr>
       <w:r>
         <w:rPr>
           <w:rFonts w:ascii="Calibri" w:hAnsi="Calibri" w:eastAsia="宋体"/>
-          <w:sz w:val="22"/>
-        </w:rPr>
-        <w:t>本次实验围绕 Whitted Style Ray Tracing 光线跟踪展开，目标是在给定框架中补全从相机发射光线、阴影判断、镜面反射递归和折射递归等关键部分，生成包含漫反射、镜面反射、折射和阴影效果的 PPM 图像。</w:t>
-      </w:r>
-    </w:p>
-    <w:p>
-      <w:pPr>
-        <w:spacing w:before="0" w:after="120" w:line="269" w:lineRule="auto"/>
-        <w:ind w:firstLine="418"/>
-      </w:pPr>
-      <w:r>
-        <w:rPr>
-          <w:rFonts w:ascii="Calibri" w:hAnsi="Calibri" w:eastAsia="宋体"/>
-          <w:sz w:val="22"/>
-        </w:rPr>
-        <w:t>通过实现该程序，我需要理解光线与球体求交、Phong 光照模型、shadow ray 可见性测试、递归反射光线、透明材质折射光线以及递归深度控制之间的关系。</w:t>
-      </w:r>
-    </w:p>
-    <w:p>
-      <w:pPr>
-        <w:spacing w:before="200" w:after="120" w:line="269" w:lineRule="auto"/>
+          <w:b w:val="0"/>
+          <w:sz w:val="24"/>
+        </w:rPr>
+        <w:t>阅读 exp6_RayTracing.doc 后，首先修改 camera.hpp 中的 GenerateRay 函数。原始程序固定返回成像平面中心方向，因此所有像素发出的光线相同，运行结果会接近纯色。修改后利用 u、v 在成像平面上定位当前像素点，并从相机原点发射对应光线。</w:t>
+      </w:r>
+    </w:p>
+    <w:p>
+      <w:pPr>
+        <w:spacing w:before="0" w:after="80" w:line="276" w:lineRule="auto"/>
       </w:pPr>
       <w:r>
         <w:rPr>
           <w:rFonts w:ascii="Calibri" w:hAnsi="Calibri" w:eastAsia="宋体"/>
           <w:b/>
-          <w:color w:val="1F4D78"/>
-          <w:sz w:val="28"/>
-        </w:rPr>
-        <w:t>二、实验环境与材料阅读</w:t>
-      </w:r>
-    </w:p>
-    <w:p>
-      <w:pPr>
-        <w:spacing w:before="0" w:after="120" w:line="269" w:lineRule="auto"/>
-        <w:ind w:firstLine="418"/>
-      </w:pPr>
-      <w:r>
-        <w:rPr>
-          <w:rFonts w:ascii="Calibri" w:hAnsi="Calibri" w:eastAsia="宋体"/>
-          <w:sz w:val="22"/>
-        </w:rPr>
-        <w:t>实验材料来自 exp6_stu.zip，其中 exp6_RayTracing.doc 给出详细实验步骤，exp6.pptx 对本节任务和提交方式作补充说明，源码目录包含 exp6.cpp、camera.hpp、ray.hpp、raytracer.hpp、scene.hpp 和 ppm.hpp。iview454_setup.exe.zip 中包含 IrfanView 安装程序，用于在 Windows 环境下查看生成的 PPM 图像。</w:t>
-      </w:r>
-    </w:p>
-    <w:p>
-      <w:pPr>
-        <w:spacing w:before="0" w:after="120" w:line="269" w:lineRule="auto"/>
-        <w:ind w:firstLine="418"/>
-      </w:pPr>
-      <w:r>
-        <w:rPr>
-          <w:rFonts w:ascii="Calibri" w:hAnsi="Calibri" w:eastAsia="宋体"/>
-          <w:sz w:val="22"/>
-        </w:rPr>
-        <w:t>文档要求本次实验完成 1 个必做任务：自行实现 Whitted 光线跟踪程序，至少实现漫反射、镜面反射和折射效果；附加动画为可选项。本次提交完成必做内容，未将附加动画作为提交内容。</w:t>
-      </w:r>
-    </w:p>
-    <w:p>
-      <w:pPr>
-        <w:spacing w:before="0" w:after="120" w:line="269" w:lineRule="auto"/>
-        <w:ind w:firstLine="418"/>
-      </w:pPr>
-      <w:r>
-        <w:rPr>
-          <w:rFonts w:ascii="Calibri" w:hAnsi="Calibri" w:eastAsia="宋体"/>
-          <w:sz w:val="22"/>
-        </w:rPr>
-        <w:t>本机验证环境为 macOS arm64、g++、Eigen3；Windows 可执行文件通过 GitHub Actions 的 windows-latest runner 使用 MSYS2 UCRT64 g++ 静态编译生成。</w:t>
-      </w:r>
-    </w:p>
-    <w:p>
-      <w:pPr>
-        <w:spacing w:before="200" w:after="120" w:line="269" w:lineRule="auto"/>
+          <w:sz w:val="24"/>
+        </w:rPr>
+        <w:t>关键代码截图：</w:t>
+      </w:r>
+    </w:p>
+    <w:p>
+      <w:pPr>
+        <w:spacing w:before="0" w:after="160" w:line="240" w:lineRule="auto"/>
+        <w:ind w:left="504"/>
+      </w:pPr>
+      <w:r>
+        <w:rPr>
+          <w:rFonts w:ascii="Courier New" w:hAnsi="Courier New" w:eastAsia="宋体"/>
+          <w:sz w:val="18"/>
+        </w:rPr>
+        <w:t>return Ray(_origin,</w:t>
+      </w:r>
+      <w:r>
+        <w:br/>
+      </w:r>
+      <w:r>
+        <w:rPr>
+          <w:rFonts w:ascii="Courier New" w:hAnsi="Courier New" w:eastAsia="宋体"/>
+          <w:sz w:val="18"/>
+        </w:rPr>
+        <w:t xml:space="preserve">    _lower_left_corner + u * _horizontal + v * _vetical - _origin);</w:t>
+      </w:r>
+    </w:p>
+    <w:p>
+      <w:pPr>
+        <w:spacing w:before="0" w:after="80" w:line="276" w:lineRule="auto"/>
       </w:pPr>
       <w:r>
         <w:rPr>
           <w:rFonts w:ascii="Calibri" w:hAnsi="Calibri" w:eastAsia="宋体"/>
           <w:b/>
-          <w:color w:val="1F4D78"/>
-          <w:sz w:val="28"/>
-        </w:rPr>
-        <w:t>三、Task1：Whitted Style 光线跟踪实现</w:t>
-      </w:r>
-    </w:p>
-    <w:p>
-      <w:pPr>
-        <w:spacing w:before="120" w:after="120" w:line="269" w:lineRule="auto"/>
+          <w:sz w:val="24"/>
+        </w:rPr>
+        <w:t>运行结果截图：</w:t>
+      </w:r>
+    </w:p>
+    <w:p>
+      <w:pPr>
+        <w:spacing w:before="0" w:after="160" w:line="276" w:lineRule="auto"/>
+        <w:ind w:firstLine="403"/>
+      </w:pPr>
+      <w:r>
+        <w:rPr>
+          <w:rFonts w:ascii="Calibri" w:hAnsi="Calibri" w:eastAsia="宋体"/>
+          <w:b w:val="0"/>
+          <w:sz w:val="24"/>
+        </w:rPr>
+        <w:t>光线生成正确后，画面中能够看到不同球体和地面，不再是纯色背景。综合运行结果见图 1。</w:t>
+      </w:r>
+    </w:p>
+    <w:p>
+      <w:pPr>
+        <w:spacing w:before="200" w:after="200" w:line="276" w:lineRule="auto"/>
+      </w:pPr>
+      <w:r>
+        <w:rPr>
+          <w:rFonts w:ascii="Calibri" w:hAnsi="Calibri" w:eastAsia="黑体"/>
+          <w:b/>
+          <w:sz w:val="30"/>
+        </w:rPr>
+        <w:t>2. 阴影判断</w:t>
+      </w:r>
+    </w:p>
+    <w:p>
+      <w:pPr>
+        <w:spacing w:before="0" w:after="80" w:line="276" w:lineRule="auto"/>
       </w:pPr>
       <w:r>
         <w:rPr>
           <w:rFonts w:ascii="Calibri" w:hAnsi="Calibri" w:eastAsia="宋体"/>
           <w:b/>
-          <w:color w:val="000000"/>
           <w:sz w:val="24"/>
         </w:rPr>
-        <w:t>1. 光线生成</w:t>
-      </w:r>
-    </w:p>
-    <w:p>
-      <w:pPr>
-        <w:spacing w:before="0" w:after="120" w:line="269" w:lineRule="auto"/>
-        <w:ind w:firstLine="418"/>
+        <w:t>操作流程：</w:t>
+      </w:r>
+    </w:p>
+    <w:p>
+      <w:pPr>
+        <w:spacing w:before="0" w:after="160" w:line="276" w:lineRule="auto"/>
+        <w:ind w:firstLine="403"/>
       </w:pPr>
       <w:r>
         <w:rPr>
           <w:rFonts w:ascii="Calibri" w:hAnsi="Calibri" w:eastAsia="宋体"/>
-          <w:sz w:val="22"/>
-        </w:rPr>
-        <w:t>camera.hpp 中的 GenerateRay 使用归一化屏幕坐标 u、v 在成像平面上定位像素点，再从相机原点指向该像素点生成光线。原始代码固定返回成像平面中心方向，导致所有像素颜色相同；修正后每个像素都有对应方向。</w:t>
-      </w:r>
-    </w:p>
-    <w:p>
-      <w:pPr>
-        <w:spacing w:before="40" w:after="140" w:line="240" w:lineRule="auto"/>
-        <w:ind w:left="360"/>
+          <w:b w:val="0"/>
+          <w:sz w:val="24"/>
+        </w:rPr>
+        <w:t>在 raytracer.hpp 的 RayColor 函数中，从命中点沿光源方向构造 shadow ray。若该光线在到达光源之前与场景中的其他球体发生有效相交，则说明该点处于阴影中，只保留环境光，不再叠加直接漫反射和高光。</w:t>
+      </w:r>
+    </w:p>
+    <w:p>
+      <w:pPr>
+        <w:spacing w:before="0" w:after="80" w:line="276" w:lineRule="auto"/>
+      </w:pPr>
+      <w:r>
+        <w:rPr>
+          <w:rFonts w:ascii="Calibri" w:hAnsi="Calibri" w:eastAsia="宋体"/>
+          <w:b/>
+          <w:sz w:val="24"/>
+        </w:rPr>
+        <w:t>关键代码截图：</w:t>
+      </w:r>
+    </w:p>
+    <w:p>
+      <w:pPr>
+        <w:spacing w:before="0" w:after="160" w:line="240" w:lineRule="auto"/>
+        <w:ind w:left="504"/>
       </w:pPr>
       <w:r>
         <w:rPr>
           <w:rFonts w:ascii="Courier New" w:hAnsi="Courier New" w:eastAsia="宋体"/>
           <w:sz w:val="18"/>
         </w:rPr>
-        <w:t>return Ray(_origin,</w:t>
-      </w:r>
-      <w:r>
-        <w:rPr>
-          <w:rFonts w:ascii="Calibri" w:hAnsi="Calibri" w:eastAsia="宋体"/>
-          <w:sz w:val="22"/>
-        </w:rPr>
+        <w:t>Vector3f lightVec = lightpos - closest_hp.position;</w:t>
+      </w:r>
+      <w:r>
         <w:br/>
       </w:r>
       <w:r>
@@ -284,53 +608,221 @@
           <w:rFonts w:ascii="Courier New" w:hAnsi="Courier New" w:eastAsia="宋体"/>
           <w:sz w:val="18"/>
         </w:rPr>
-        <w:t xml:space="preserve">    _lower_left_corner + u * _horizontal + v * _vetical - _origin);</w:t>
-      </w:r>
-    </w:p>
-    <w:p>
-      <w:pPr>
-        <w:spacing w:before="120" w:after="120" w:line="269" w:lineRule="auto"/>
+        <w:t>float lightDistance = lightVec.norm();</w:t>
+      </w:r>
+      <w:r>
+        <w:br/>
+      </w:r>
+      <w:r>
+        <w:rPr>
+          <w:rFonts w:ascii="Courier New" w:hAnsi="Courier New" w:eastAsia="宋体"/>
+          <w:sz w:val="18"/>
+        </w:rPr>
+        <w:t>Vector3f lightDir = lightVec.normalized();</w:t>
+      </w:r>
+      <w:r>
+        <w:br/>
+      </w:r>
+      <w:r>
+        <w:rPr>
+          <w:rFonts w:ascii="Courier New" w:hAnsi="Courier New" w:eastAsia="宋体"/>
+          <w:sz w:val="18"/>
+        </w:rPr>
+        <w:t>Ray shadow_ray(closest_hp.position + 1e-3 * lightDir, lightDir);</w:t>
+      </w:r>
+      <w:r>
+        <w:br/>
+      </w:r>
+      <w:r>
+        <w:rPr>
+          <w:rFonts w:ascii="Courier New" w:hAnsi="Courier New" w:eastAsia="宋体"/>
+          <w:sz w:val="18"/>
+        </w:rPr>
+      </w:r>
+      <w:r>
+        <w:br/>
+      </w:r>
+      <w:r>
+        <w:rPr>
+          <w:rFonts w:ascii="Courier New" w:hAnsi="Courier New" w:eastAsia="宋体"/>
+          <w:sz w:val="18"/>
+        </w:rPr>
+        <w:t>for (int i = 0; i &lt; scene.ObjectCount(); ++i) {</w:t>
+      </w:r>
+      <w:r>
+        <w:br/>
+      </w:r>
+      <w:r>
+        <w:rPr>
+          <w:rFonts w:ascii="Courier New" w:hAnsi="Courier New" w:eastAsia="宋体"/>
+          <w:sz w:val="18"/>
+        </w:rPr>
+        <w:t xml:space="preserve">    HitInfo shadowHit;</w:t>
+      </w:r>
+      <w:r>
+        <w:br/>
+      </w:r>
+      <w:r>
+        <w:rPr>
+          <w:rFonts w:ascii="Courier New" w:hAnsi="Courier New" w:eastAsia="宋体"/>
+          <w:sz w:val="18"/>
+        </w:rPr>
+        <w:t xml:space="preserve">    if (scene.GetObjectPtr(i)-&gt;Hit(shadow_ray, shadowHit)</w:t>
+      </w:r>
+      <w:r>
+        <w:br/>
+      </w:r>
+      <w:r>
+        <w:rPr>
+          <w:rFonts w:ascii="Courier New" w:hAnsi="Courier New" w:eastAsia="宋体"/>
+          <w:sz w:val="18"/>
+        </w:rPr>
+        <w:t xml:space="preserve">        &amp;&amp; shadowHit.t &gt; 1e-3</w:t>
+      </w:r>
+      <w:r>
+        <w:br/>
+      </w:r>
+      <w:r>
+        <w:rPr>
+          <w:rFonts w:ascii="Courier New" w:hAnsi="Courier New" w:eastAsia="宋体"/>
+          <w:sz w:val="18"/>
+        </w:rPr>
+        <w:t xml:space="preserve">        &amp;&amp; shadowHit.t &lt; lightDistance) {</w:t>
+      </w:r>
+      <w:r>
+        <w:br/>
+      </w:r>
+      <w:r>
+        <w:rPr>
+          <w:rFonts w:ascii="Courier New" w:hAnsi="Courier New" w:eastAsia="宋体"/>
+          <w:sz w:val="18"/>
+        </w:rPr>
+        <w:t xml:space="preserve">        isShadow = true;</w:t>
+      </w:r>
+      <w:r>
+        <w:br/>
+      </w:r>
+      <w:r>
+        <w:rPr>
+          <w:rFonts w:ascii="Courier New" w:hAnsi="Courier New" w:eastAsia="宋体"/>
+          <w:sz w:val="18"/>
+        </w:rPr>
+        <w:t xml:space="preserve">        break;</w:t>
+      </w:r>
+      <w:r>
+        <w:br/>
+      </w:r>
+      <w:r>
+        <w:rPr>
+          <w:rFonts w:ascii="Courier New" w:hAnsi="Courier New" w:eastAsia="宋体"/>
+          <w:sz w:val="18"/>
+        </w:rPr>
+        <w:t xml:space="preserve">    }</w:t>
+      </w:r>
+      <w:r>
+        <w:br/>
+      </w:r>
+      <w:r>
+        <w:rPr>
+          <w:rFonts w:ascii="Courier New" w:hAnsi="Courier New" w:eastAsia="宋体"/>
+          <w:sz w:val="18"/>
+        </w:rPr>
+        <w:t>}</w:t>
+      </w:r>
+    </w:p>
+    <w:p>
+      <w:pPr>
+        <w:spacing w:before="0" w:after="80" w:line="276" w:lineRule="auto"/>
       </w:pPr>
       <w:r>
         <w:rPr>
           <w:rFonts w:ascii="Calibri" w:hAnsi="Calibri" w:eastAsia="宋体"/>
           <w:b/>
-          <w:color w:val="000000"/>
           <w:sz w:val="24"/>
         </w:rPr>
-        <w:t>2. 阴影判断</w:t>
-      </w:r>
-    </w:p>
-    <w:p>
-      <w:pPr>
-        <w:spacing w:before="0" w:after="120" w:line="269" w:lineRule="auto"/>
-        <w:ind w:firstLine="418"/>
+        <w:t>运行结果截图：</w:t>
+      </w:r>
+    </w:p>
+    <w:p>
+      <w:pPr>
+        <w:spacing w:before="0" w:after="160" w:line="276" w:lineRule="auto"/>
+        <w:ind w:firstLine="403"/>
       </w:pPr>
       <w:r>
         <w:rPr>
           <w:rFonts w:ascii="Calibri" w:hAnsi="Calibri" w:eastAsia="宋体"/>
-          <w:sz w:val="22"/>
-        </w:rPr>
-        <w:t>raytracer.hpp 中在命中点到光源之间构造 shadow ray。若该光线在到达光源之前与任意球体发生有效相交，则说明光源被遮挡，该点只保留环境光，不再叠加直接漫反射和高光。</w:t>
-      </w:r>
-    </w:p>
-    <w:p>
-      <w:pPr>
-        <w:spacing w:before="40" w:after="140" w:line="240" w:lineRule="auto"/>
-        <w:ind w:left="360"/>
+          <w:b w:val="0"/>
+          <w:sz w:val="24"/>
+        </w:rPr>
+        <w:t>完成阴影判断后，球体在地面上形成可见投影，遮挡关系与光源位置一致。</w:t>
+      </w:r>
+    </w:p>
+    <w:p>
+      <w:pPr>
+        <w:spacing w:before="200" w:after="200" w:line="276" w:lineRule="auto"/>
+      </w:pPr>
+      <w:r>
+        <w:rPr>
+          <w:rFonts w:ascii="Calibri" w:hAnsi="Calibri" w:eastAsia="黑体"/>
+          <w:b/>
+          <w:sz w:val="30"/>
+        </w:rPr>
+        <w:t>3. 镜面反射</w:t>
+      </w:r>
+    </w:p>
+    <w:p>
+      <w:pPr>
+        <w:spacing w:before="0" w:after="80" w:line="276" w:lineRule="auto"/>
+      </w:pPr>
+      <w:r>
+        <w:rPr>
+          <w:rFonts w:ascii="Calibri" w:hAnsi="Calibri" w:eastAsia="宋体"/>
+          <w:b/>
+          <w:sz w:val="24"/>
+        </w:rPr>
+        <w:t>操作流程：</w:t>
+      </w:r>
+    </w:p>
+    <w:p>
+      <w:pPr>
+        <w:spacing w:before="0" w:after="160" w:line="276" w:lineRule="auto"/>
+        <w:ind w:firstLine="403"/>
+      </w:pPr>
+      <w:r>
+        <w:rPr>
+          <w:rFonts w:ascii="Calibri" w:hAnsi="Calibri" w:eastAsia="宋体"/>
+          <w:b w:val="0"/>
+          <w:sz w:val="24"/>
+        </w:rPr>
+        <w:t>对于 reflective 材质，根据视线方向和法线计算反射方向，并沿该方向递归调用 RayColor。程序使用 MAXDEPTH 限制递归深度，避免反射路径无限递归。</w:t>
+      </w:r>
+    </w:p>
+    <w:p>
+      <w:pPr>
+        <w:spacing w:before="0" w:after="80" w:line="276" w:lineRule="auto"/>
+      </w:pPr>
+      <w:r>
+        <w:rPr>
+          <w:rFonts w:ascii="Calibri" w:hAnsi="Calibri" w:eastAsia="宋体"/>
+          <w:b/>
+          <w:sz w:val="24"/>
+        </w:rPr>
+        <w:t>关键代码截图：</w:t>
+      </w:r>
+    </w:p>
+    <w:p>
+      <w:pPr>
+        <w:spacing w:before="0" w:after="160" w:line="240" w:lineRule="auto"/>
+        <w:ind w:left="504"/>
       </w:pPr>
       <w:r>
         <w:rPr>
           <w:rFonts w:ascii="Courier New" w:hAnsi="Courier New" w:eastAsia="宋体"/>
           <w:sz w:val="18"/>
         </w:rPr>
-        <w:t>Vector3f lightVec = lightpos - closest_hp.position;</w:t>
-      </w:r>
-      <w:r>
-        <w:rPr>
-          <w:rFonts w:ascii="Calibri" w:hAnsi="Calibri" w:eastAsia="宋体"/>
-          <w:sz w:val="22"/>
-        </w:rPr>
+        <w:t>if (depth &gt;= MAXDEPTH) {</w:t>
+      </w:r>
+      <w:r>
         <w:br/>
       </w:r>
       <w:r>
@@ -338,13 +830,9 @@
           <w:rFonts w:ascii="Courier New" w:hAnsi="Courier New" w:eastAsia="宋体"/>
           <w:sz w:val="18"/>
         </w:rPr>
-        <w:t>float lightDistance = lightVec.norm();</w:t>
-      </w:r>
-      <w:r>
-        <w:rPr>
-          <w:rFonts w:ascii="Calibri" w:hAnsi="Calibri" w:eastAsia="宋体"/>
-          <w:sz w:val="22"/>
-        </w:rPr>
+        <w:t xml:space="preserve">    return Vector3f(0.0, 0.0, 0.0);</w:t>
+      </w:r>
+      <w:r>
         <w:br/>
       </w:r>
       <w:r>
@@ -352,13 +840,9 @@
           <w:rFonts w:ascii="Courier New" w:hAnsi="Courier New" w:eastAsia="宋体"/>
           <w:sz w:val="18"/>
         </w:rPr>
-        <w:t>Vector3f lightDir = lightVec.normalized();</w:t>
-      </w:r>
-      <w:r>
-        <w:rPr>
-          <w:rFonts w:ascii="Calibri" w:hAnsi="Calibri" w:eastAsia="宋体"/>
-          <w:sz w:val="22"/>
-        </w:rPr>
+        <w:t>}</w:t>
+      </w:r>
+      <w:r>
         <w:br/>
       </w:r>
       <w:r>
@@ -366,13 +850,8 @@
           <w:rFonts w:ascii="Courier New" w:hAnsi="Courier New" w:eastAsia="宋体"/>
           <w:sz w:val="18"/>
         </w:rPr>
-        <w:t>Ray shadow_ray(closest_hp.position + 1e-3 * lightDir, lightDir);</w:t>
-      </w:r>
-      <w:r>
-        <w:rPr>
-          <w:rFonts w:ascii="Calibri" w:hAnsi="Calibri" w:eastAsia="宋体"/>
-          <w:sz w:val="22"/>
-        </w:rPr>
+      </w:r>
+      <w:r>
         <w:br/>
       </w:r>
       <w:r>
@@ -380,12 +859,9 @@
           <w:rFonts w:ascii="Courier New" w:hAnsi="Courier New" w:eastAsia="宋体"/>
           <w:sz w:val="18"/>
         </w:rPr>
-      </w:r>
-      <w:r>
-        <w:rPr>
-          <w:rFonts w:ascii="Calibri" w:hAnsi="Calibri" w:eastAsia="宋体"/>
-          <w:sz w:val="22"/>
-        </w:rPr>
+        <w:t>if (mtl._reflective) {</w:t>
+      </w:r>
+      <w:r>
         <w:br/>
       </w:r>
       <w:r>
@@ -393,13 +869,9 @@
           <w:rFonts w:ascii="Courier New" w:hAnsi="Courier New" w:eastAsia="宋体"/>
           <w:sz w:val="18"/>
         </w:rPr>
-        <w:t>for (int i = 0; i &lt; scene.ObjectCount(); ++i) {</w:t>
-      </w:r>
-      <w:r>
-        <w:rPr>
-          <w:rFonts w:ascii="Calibri" w:hAnsi="Calibri" w:eastAsia="宋体"/>
-          <w:sz w:val="22"/>
-        </w:rPr>
+        <w:t xml:space="preserve">    reflectColor = RayColor(reflectRay, scene, depth + 1, test);</w:t>
+      </w:r>
+      <w:r>
         <w:br/>
       </w:r>
       <w:r>
@@ -407,27 +879,102 @@
           <w:rFonts w:ascii="Courier New" w:hAnsi="Courier New" w:eastAsia="宋体"/>
           <w:sz w:val="18"/>
         </w:rPr>
-        <w:t xml:space="preserve">    HitInfo shadowHit;</w:t>
-      </w:r>
+        <w:t>}</w:t>
+      </w:r>
+    </w:p>
+    <w:p>
+      <w:pPr>
+        <w:spacing w:before="0" w:after="80" w:line="276" w:lineRule="auto"/>
+      </w:pPr>
       <w:r>
         <w:rPr>
           <w:rFonts w:ascii="Calibri" w:hAnsi="Calibri" w:eastAsia="宋体"/>
-          <w:sz w:val="22"/>
-        </w:rPr>
-        <w:br/>
-      </w:r>
+          <w:b/>
+          <w:sz w:val="24"/>
+        </w:rPr>
+        <w:t>运行结果截图：</w:t>
+      </w:r>
+    </w:p>
+    <w:p>
+      <w:pPr>
+        <w:spacing w:before="0" w:after="160" w:line="276" w:lineRule="auto"/>
+        <w:ind w:firstLine="403"/>
+      </w:pPr>
+      <w:r>
+        <w:rPr>
+          <w:rFonts w:ascii="Calibri" w:hAnsi="Calibri" w:eastAsia="宋体"/>
+          <w:b w:val="0"/>
+          <w:sz w:val="24"/>
+        </w:rPr>
+        <w:t>完成反射递归后，中央黄色球面可以看到场景反射，符合实验文档要求的镜面反射效果。</w:t>
+      </w:r>
+    </w:p>
+    <w:p>
+      <w:pPr>
+        <w:spacing w:before="200" w:after="200" w:line="276" w:lineRule="auto"/>
+      </w:pPr>
+      <w:r>
+        <w:rPr>
+          <w:rFonts w:ascii="Calibri" w:hAnsi="Calibri" w:eastAsia="黑体"/>
+          <w:b/>
+          <w:sz w:val="30"/>
+        </w:rPr>
+        <w:t>4. 折射效果</w:t>
+      </w:r>
+    </w:p>
+    <w:p>
+      <w:pPr>
+        <w:spacing w:before="0" w:after="80" w:line="276" w:lineRule="auto"/>
+      </w:pPr>
+      <w:r>
+        <w:rPr>
+          <w:rFonts w:ascii="Calibri" w:hAnsi="Calibri" w:eastAsia="宋体"/>
+          <w:b/>
+          <w:sz w:val="24"/>
+        </w:rPr>
+        <w:t>操作流程：</w:t>
+      </w:r>
+    </w:p>
+    <w:p>
+      <w:pPr>
+        <w:spacing w:before="0" w:after="160" w:line="276" w:lineRule="auto"/>
+        <w:ind w:firstLine="403"/>
+      </w:pPr>
+      <w:r>
+        <w:rPr>
+          <w:rFonts w:ascii="Calibri" w:hAnsi="Calibri" w:eastAsia="宋体"/>
+          <w:b w:val="0"/>
+          <w:sz w:val="24"/>
+        </w:rPr>
+        <w:t>对于 transparent 材质，根据光线进入或离开介质选择不同折射率比，调用 Refract 计算折射方向。折射成立时，从命中点沿折射方向做小偏移后继续递归追踪折射光线。</w:t>
+      </w:r>
+    </w:p>
+    <w:p>
+      <w:pPr>
+        <w:spacing w:before="0" w:after="80" w:line="276" w:lineRule="auto"/>
+      </w:pPr>
+      <w:r>
+        <w:rPr>
+          <w:rFonts w:ascii="Calibri" w:hAnsi="Calibri" w:eastAsia="宋体"/>
+          <w:b/>
+          <w:sz w:val="24"/>
+        </w:rPr>
+        <w:t>关键代码截图：</w:t>
+      </w:r>
+    </w:p>
+    <w:p>
+      <w:pPr>
+        <w:spacing w:before="0" w:after="160" w:line="240" w:lineRule="auto"/>
+        <w:ind w:left="504"/>
+      </w:pPr>
       <w:r>
         <w:rPr>
           <w:rFonts w:ascii="Courier New" w:hAnsi="Courier New" w:eastAsia="宋体"/>
           <w:sz w:val="18"/>
         </w:rPr>
-        <w:t xml:space="preserve">    if (scene.GetObjectPtr(i)-&gt;Hit(shadow_ray, shadowHit)</w:t>
-      </w:r>
-      <w:r>
-        <w:rPr>
-          <w:rFonts w:ascii="Calibri" w:hAnsi="Calibri" w:eastAsia="宋体"/>
-          <w:sz w:val="22"/>
-        </w:rPr>
+        <w:t>if (refract) {</w:t>
+      </w:r>
+      <w:r>
         <w:br/>
       </w:r>
       <w:r>
@@ -435,13 +982,9 @@
           <w:rFonts w:ascii="Courier New" w:hAnsi="Courier New" w:eastAsia="宋体"/>
           <w:sz w:val="18"/>
         </w:rPr>
-        <w:t xml:space="preserve">        &amp;&amp; shadowHit.t &gt; 1e-3</w:t>
-      </w:r>
-      <w:r>
-        <w:rPr>
-          <w:rFonts w:ascii="Calibri" w:hAnsi="Calibri" w:eastAsia="宋体"/>
-          <w:sz w:val="22"/>
-        </w:rPr>
+        <w:t xml:space="preserve">    Ray refractRay(closest_hp.position, refractDir);</w:t>
+      </w:r>
+      <w:r>
         <w:br/>
       </w:r>
       <w:r>
@@ -449,13 +992,9 @@
           <w:rFonts w:ascii="Courier New" w:hAnsi="Courier New" w:eastAsia="宋体"/>
           <w:sz w:val="18"/>
         </w:rPr>
-        <w:t xml:space="preserve">        &amp;&amp; shadowHit.t &lt; lightDistance) {</w:t>
-      </w:r>
-      <w:r>
-        <w:rPr>
-          <w:rFonts w:ascii="Calibri" w:hAnsi="Calibri" w:eastAsia="宋体"/>
-          <w:sz w:val="22"/>
-        </w:rPr>
+        <w:t xml:space="preserve">    refractRay._origin = closest_hp.position + 1e-2 * refractDir.normalized();</w:t>
+      </w:r>
+      <w:r>
         <w:br/>
       </w:r>
       <w:r>
@@ -463,13 +1002,9 @@
           <w:rFonts w:ascii="Courier New" w:hAnsi="Courier New" w:eastAsia="宋体"/>
           <w:sz w:val="18"/>
         </w:rPr>
-        <w:t xml:space="preserve">        isShadow = true;</w:t>
-      </w:r>
-      <w:r>
-        <w:rPr>
-          <w:rFonts w:ascii="Calibri" w:hAnsi="Calibri" w:eastAsia="宋体"/>
-          <w:sz w:val="22"/>
-        </w:rPr>
+        <w:t xml:space="preserve">    refractionColor = RayColor(refractRay, scene, depth + 1, test);</w:t>
+      </w:r>
+      <w:r>
         <w:br/>
       </w:r>
       <w:r>
@@ -477,296 +1012,46 @@
           <w:rFonts w:ascii="Courier New" w:hAnsi="Courier New" w:eastAsia="宋体"/>
           <w:sz w:val="18"/>
         </w:rPr>
-        <w:t xml:space="preserve">        break;</w:t>
-      </w:r>
-      <w:r>
-        <w:rPr>
-          <w:rFonts w:ascii="Calibri" w:hAnsi="Calibri" w:eastAsia="宋体"/>
-          <w:sz w:val="22"/>
-        </w:rPr>
-        <w:br/>
-      </w:r>
-      <w:r>
-        <w:rPr>
-          <w:rFonts w:ascii="Courier New" w:hAnsi="Courier New" w:eastAsia="宋体"/>
-          <w:sz w:val="18"/>
-        </w:rPr>
-        <w:t xml:space="preserve">    }</w:t>
-      </w:r>
-      <w:r>
-        <w:rPr>
-          <w:rFonts w:ascii="Calibri" w:hAnsi="Calibri" w:eastAsia="宋体"/>
-          <w:sz w:val="22"/>
-        </w:rPr>
-        <w:br/>
-      </w:r>
-      <w:r>
-        <w:rPr>
-          <w:rFonts w:ascii="Courier New" w:hAnsi="Courier New" w:eastAsia="宋体"/>
-          <w:sz w:val="18"/>
-        </w:rPr>
         <w:t>}</w:t>
       </w:r>
     </w:p>
     <w:p>
       <w:pPr>
-        <w:spacing w:before="120" w:after="120" w:line="269" w:lineRule="auto"/>
+        <w:spacing w:before="0" w:after="80" w:line="276" w:lineRule="auto"/>
       </w:pPr>
       <w:r>
         <w:rPr>
           <w:rFonts w:ascii="Calibri" w:hAnsi="Calibri" w:eastAsia="宋体"/>
           <w:b/>
-          <w:color w:val="000000"/>
           <w:sz w:val="24"/>
         </w:rPr>
-        <w:t>3. 镜面反射递归</w:t>
-      </w:r>
-    </w:p>
-    <w:p>
-      <w:pPr>
-        <w:spacing w:before="0" w:after="120" w:line="269" w:lineRule="auto"/>
-        <w:ind w:firstLine="418"/>
+        <w:t>运行结果截图：</w:t>
+      </w:r>
+    </w:p>
+    <w:p>
+      <w:pPr>
+        <w:spacing w:before="0" w:after="160" w:line="276" w:lineRule="auto"/>
+        <w:ind w:firstLine="403"/>
       </w:pPr>
       <w:r>
         <w:rPr>
           <w:rFonts w:ascii="Calibri" w:hAnsi="Calibri" w:eastAsia="宋体"/>
-          <w:sz w:val="22"/>
-        </w:rPr>
-        <w:t>对于 reflective 材质，根据视线方向和法线计算反射方向，沿反射方向发射新的光线，并递归调用 RayColor 得到反射颜色。程序使用 MAXDEPTH 限制递归深度，避免反射和折射在复杂路径中无限递归。</w:t>
-      </w:r>
-    </w:p>
-    <w:p>
-      <w:pPr>
-        <w:spacing w:before="40" w:after="140" w:line="240" w:lineRule="auto"/>
-        <w:ind w:left="360"/>
-      </w:pPr>
-      <w:r>
-        <w:rPr>
-          <w:rFonts w:ascii="Courier New" w:hAnsi="Courier New" w:eastAsia="宋体"/>
-          <w:sz w:val="18"/>
-        </w:rPr>
-        <w:t>if (depth &gt;= MAXDEPTH) {</w:t>
-      </w:r>
-      <w:r>
-        <w:rPr>
-          <w:rFonts w:ascii="Calibri" w:hAnsi="Calibri" w:eastAsia="宋体"/>
-          <w:sz w:val="22"/>
-        </w:rPr>
-        <w:br/>
-      </w:r>
-      <w:r>
-        <w:rPr>
-          <w:rFonts w:ascii="Courier New" w:hAnsi="Courier New" w:eastAsia="宋体"/>
-          <w:sz w:val="18"/>
-        </w:rPr>
-        <w:t xml:space="preserve">    return Vector3f(0.0, 0.0, 0.0);</w:t>
-      </w:r>
-      <w:r>
-        <w:rPr>
-          <w:rFonts w:ascii="Calibri" w:hAnsi="Calibri" w:eastAsia="宋体"/>
-          <w:sz w:val="22"/>
-        </w:rPr>
-        <w:br/>
-      </w:r>
-      <w:r>
-        <w:rPr>
-          <w:rFonts w:ascii="Courier New" w:hAnsi="Courier New" w:eastAsia="宋体"/>
-          <w:sz w:val="18"/>
-        </w:rPr>
-        <w:t>}</w:t>
-      </w:r>
-      <w:r>
-        <w:rPr>
-          <w:rFonts w:ascii="Calibri" w:hAnsi="Calibri" w:eastAsia="宋体"/>
-          <w:sz w:val="22"/>
-        </w:rPr>
-        <w:br/>
-      </w:r>
-      <w:r>
-        <w:rPr>
-          <w:rFonts w:ascii="Courier New" w:hAnsi="Courier New" w:eastAsia="宋体"/>
-          <w:sz w:val="18"/>
-        </w:rPr>
-      </w:r>
-      <w:r>
-        <w:rPr>
-          <w:rFonts w:ascii="Calibri" w:hAnsi="Calibri" w:eastAsia="宋体"/>
-          <w:sz w:val="22"/>
-        </w:rPr>
-        <w:br/>
-      </w:r>
-      <w:r>
-        <w:rPr>
-          <w:rFonts w:ascii="Courier New" w:hAnsi="Courier New" w:eastAsia="宋体"/>
-          <w:sz w:val="18"/>
-        </w:rPr>
-        <w:t>if (mtl._reflective) {</w:t>
-      </w:r>
-      <w:r>
-        <w:rPr>
-          <w:rFonts w:ascii="Calibri" w:hAnsi="Calibri" w:eastAsia="宋体"/>
-          <w:sz w:val="22"/>
-        </w:rPr>
-        <w:br/>
-      </w:r>
-      <w:r>
-        <w:rPr>
-          <w:rFonts w:ascii="Courier New" w:hAnsi="Courier New" w:eastAsia="宋体"/>
-          <w:sz w:val="18"/>
-        </w:rPr>
-        <w:t xml:space="preserve">    reflectColor = RayColor(reflectRay, scene, depth + 1, test);</w:t>
-      </w:r>
-      <w:r>
-        <w:rPr>
-          <w:rFonts w:ascii="Calibri" w:hAnsi="Calibri" w:eastAsia="宋体"/>
-          <w:sz w:val="22"/>
-        </w:rPr>
-        <w:br/>
-      </w:r>
-      <w:r>
-        <w:rPr>
-          <w:rFonts w:ascii="Courier New" w:hAnsi="Courier New" w:eastAsia="宋体"/>
-          <w:sz w:val="18"/>
-        </w:rPr>
-        <w:t>}</w:t>
-      </w:r>
-    </w:p>
-    <w:p>
-      <w:pPr>
-        <w:spacing w:before="120" w:after="120" w:line="269" w:lineRule="auto"/>
-      </w:pPr>
-      <w:r>
-        <w:rPr>
-          <w:rFonts w:ascii="Calibri" w:hAnsi="Calibri" w:eastAsia="宋体"/>
-          <w:b/>
-          <w:color w:val="000000"/>
+          <w:b w:val="0"/>
           <w:sz w:val="24"/>
         </w:rPr>
-        <w:t>4. 折射递归</w:t>
-      </w:r>
-    </w:p>
-    <w:p>
-      <w:pPr>
-        <w:spacing w:before="0" w:after="120" w:line="269" w:lineRule="auto"/>
-        <w:ind w:firstLine="418"/>
-      </w:pPr>
-      <w:r>
-        <w:rPr>
-          <w:rFonts w:ascii="Calibri" w:hAnsi="Calibri" w:eastAsia="宋体"/>
-          <w:sz w:val="22"/>
-        </w:rPr>
-        <w:t>对于 transparent 材质，程序根据光线进入或离开介质选择不同的折射率比，并调用 Refract 计算折射方向。若折射成立，则从命中点沿折射方向偏移一个很小的距离后递归追踪折射光线。</w:t>
-      </w:r>
-    </w:p>
-    <w:p>
-      <w:pPr>
-        <w:spacing w:before="40" w:after="140" w:line="240" w:lineRule="auto"/>
-        <w:ind w:left="360"/>
-      </w:pPr>
-      <w:r>
-        <w:rPr>
-          <w:rFonts w:ascii="Courier New" w:hAnsi="Courier New" w:eastAsia="宋体"/>
-          <w:sz w:val="18"/>
-        </w:rPr>
-        <w:t>if (refract) {</w:t>
-      </w:r>
-      <w:r>
-        <w:rPr>
-          <w:rFonts w:ascii="Calibri" w:hAnsi="Calibri" w:eastAsia="宋体"/>
-          <w:sz w:val="22"/>
-        </w:rPr>
-        <w:br/>
-      </w:r>
-      <w:r>
-        <w:rPr>
-          <w:rFonts w:ascii="Courier New" w:hAnsi="Courier New" w:eastAsia="宋体"/>
-          <w:sz w:val="18"/>
-        </w:rPr>
-        <w:t xml:space="preserve">    Ray refractRay(closest_hp.position, refractDir);</w:t>
-      </w:r>
-      <w:r>
-        <w:rPr>
-          <w:rFonts w:ascii="Calibri" w:hAnsi="Calibri" w:eastAsia="宋体"/>
-          <w:sz w:val="22"/>
-        </w:rPr>
-        <w:br/>
-      </w:r>
-      <w:r>
-        <w:rPr>
-          <w:rFonts w:ascii="Courier New" w:hAnsi="Courier New" w:eastAsia="宋体"/>
-          <w:sz w:val="18"/>
-        </w:rPr>
-        <w:t xml:space="preserve">    refractRay._origin = closest_hp.position + 1e-2 * refractDir.normalized();</w:t>
-      </w:r>
-      <w:r>
-        <w:rPr>
-          <w:rFonts w:ascii="Calibri" w:hAnsi="Calibri" w:eastAsia="宋体"/>
-          <w:sz w:val="22"/>
-        </w:rPr>
-        <w:br/>
-      </w:r>
-      <w:r>
-        <w:rPr>
-          <w:rFonts w:ascii="Courier New" w:hAnsi="Courier New" w:eastAsia="宋体"/>
-          <w:sz w:val="18"/>
-        </w:rPr>
-        <w:t xml:space="preserve">    refractionColor = RayColor(refractRay, scene, depth + 1, test);</w:t>
-      </w:r>
-      <w:r>
-        <w:rPr>
-          <w:rFonts w:ascii="Calibri" w:hAnsi="Calibri" w:eastAsia="宋体"/>
-          <w:sz w:val="22"/>
-        </w:rPr>
-        <w:br/>
-      </w:r>
-      <w:r>
-        <w:rPr>
-          <w:rFonts w:ascii="Courier New" w:hAnsi="Courier New" w:eastAsia="宋体"/>
-          <w:sz w:val="18"/>
-        </w:rPr>
-        <w:t>}</w:t>
-      </w:r>
-    </w:p>
-    <w:p>
-      <w:pPr>
-        <w:spacing w:before="200" w:after="120" w:line="269" w:lineRule="auto"/>
-      </w:pPr>
-      <w:r>
-        <w:rPr>
-          <w:rFonts w:ascii="Calibri" w:hAnsi="Calibri" w:eastAsia="宋体"/>
-          <w:b/>
-          <w:color w:val="1F4D78"/>
-          <w:sz w:val="28"/>
-        </w:rPr>
-        <w:t>四、运行结果</w:t>
-      </w:r>
-    </w:p>
-    <w:p>
-      <w:pPr>
-        <w:spacing w:before="0" w:after="120" w:line="269" w:lineRule="auto"/>
-        <w:ind w:firstLine="418"/>
-      </w:pPr>
-      <w:r>
-        <w:rPr>
-          <w:rFonts w:ascii="Calibri" w:hAnsi="Calibri" w:eastAsia="宋体"/>
-          <w:sz w:val="22"/>
-        </w:rPr>
-        <w:t>本地执行 exp6_raytracing 后生成 output.ppm，并转换为 PNG 便于在报告中展示。结果图中可以观察到地面阴影、中央黄球的镜面反射效果，以及右侧透明球的折射效果，满足实验文档对必做部分的要求。</w:t>
-      </w:r>
-    </w:p>
-    <w:p>
-      <w:pPr>
+        <w:t>完成折射递归后，右侧透明球能显示折射后的场景颜色。最终生成 output.ppm，画面同时包含漫反射、阴影、镜面反射和折射效果。</w:t>
+      </w:r>
+    </w:p>
+    <w:p>
+      <w:pPr>
+        <w:spacing w:before="80" w:after="80"/>
         <w:jc w:val="center"/>
       </w:pPr>
       <w:r>
-        <w:rPr>
-          <w:rFonts w:ascii="Calibri" w:hAnsi="Calibri" w:eastAsia="宋体"/>
-          <w:sz w:val="22"/>
-        </w:rPr>
         <w:drawing>
           <wp:inline xmlns:a="http://schemas.openxmlformats.org/drawingml/2006/main" xmlns:pic="http://schemas.openxmlformats.org/drawingml/2006/picture">
-            <wp:extent cx="5669280" cy="4251960"/>
-            <wp:docPr id="1" name="Picture 1"/>
+            <wp:extent cx="5212080" cy="3909060"/>
+            <wp:docPr id="84" name="Picture 84"/>
             <wp:cNvGraphicFramePr>
               <a:graphicFrameLocks noChangeAspect="1"/>
             </wp:cNvGraphicFramePr>
@@ -786,7 +1071,7 @@
                   <pic:spPr>
                     <a:xfrm>
                       <a:off x="0" y="0"/>
-                      <a:ext cx="5669280" cy="4251960"/>
+                      <a:ext cx="5212080" cy="3909060"/>
                     </a:xfrm>
                     <a:prstGeom prst="rect"/>
                   </pic:spPr>
@@ -799,7 +1084,7 @@
     </w:p>
     <w:p>
       <w:pPr>
-        <w:spacing w:before="40" w:after="160" w:line="269" w:lineRule="auto"/>
+        <w:spacing w:before="0" w:after="200" w:line="276" w:lineRule="auto"/>
         <w:jc w:val="center"/>
       </w:pPr>
       <w:r>
@@ -809,188 +1094,7 @@
           <w:color w:val="555555"/>
           <w:sz w:val="20"/>
         </w:rPr>
-        <w:t>图 1  实验6 Ray Tracing 输出结果</w:t>
-      </w:r>
-    </w:p>
-    <w:p>
-      <w:pPr>
-        <w:spacing w:before="200" w:after="120" w:line="269" w:lineRule="auto"/>
-      </w:pPr>
-      <w:r>
-        <w:rPr>
-          <w:rFonts w:ascii="Calibri" w:hAnsi="Calibri" w:eastAsia="宋体"/>
-          <w:b/>
-          <w:color w:val="1F4D78"/>
-          <w:sz w:val="28"/>
-        </w:rPr>
-        <w:t>五、GitHub Actions Windows 可执行文件</w:t>
-      </w:r>
-    </w:p>
-    <w:p>
-      <w:pPr>
-        <w:spacing w:before="0" w:after="120" w:line="269" w:lineRule="auto"/>
-        <w:ind w:firstLine="418"/>
-      </w:pPr>
-      <w:r>
-        <w:rPr>
-          <w:rFonts w:ascii="Calibri" w:hAnsi="Calibri" w:eastAsia="宋体"/>
-          <w:sz w:val="22"/>
-        </w:rPr>
-        <w:t>仓库中的 .github/workflows/build-windows.yml 已加入实验 6 的构建步骤。workflow 在 Windows runner 上使用 MSYS2 UCRT64 的 g++ 编译 LAB6/src/exp6.cpp，生成 exp6_raytracing.exe；随后运行该程序生成 exp6_output.ppm，并随 windows-executables artifact 上传。</w:t>
-      </w:r>
-    </w:p>
-    <w:p>
-      <w:pPr>
-        <w:spacing w:before="40" w:after="140" w:line="240" w:lineRule="auto"/>
-        <w:ind w:left="360"/>
-      </w:pPr>
-      <w:r>
-        <w:rPr>
-          <w:rFonts w:ascii="Courier New" w:hAnsi="Courier New" w:eastAsia="宋体"/>
-          <w:sz w:val="18"/>
-        </w:rPr>
-        <w:t>g++ -std=c++17 -O2 -static -static-libstdc++ -static-libgcc \</w:t>
-      </w:r>
-      <w:r>
-        <w:rPr>
-          <w:rFonts w:ascii="Calibri" w:hAnsi="Calibri" w:eastAsia="宋体"/>
-          <w:sz w:val="22"/>
-        </w:rPr>
-        <w:br/>
-      </w:r>
-      <w:r>
-        <w:rPr>
-          <w:rFonts w:ascii="Courier New" w:hAnsi="Courier New" w:eastAsia="宋体"/>
-          <w:sz w:val="18"/>
-        </w:rPr>
-        <w:t xml:space="preserve">  -I/ucrt64/include/eigen3 \</w:t>
-      </w:r>
-      <w:r>
-        <w:rPr>
-          <w:rFonts w:ascii="Calibri" w:hAnsi="Calibri" w:eastAsia="宋体"/>
-          <w:sz w:val="22"/>
-        </w:rPr>
-        <w:br/>
-      </w:r>
-      <w:r>
-        <w:rPr>
-          <w:rFonts w:ascii="Courier New" w:hAnsi="Courier New" w:eastAsia="宋体"/>
-          <w:sz w:val="18"/>
-        </w:rPr>
-        <w:t xml:space="preserve">  -o build/exp6_raytracing.exe LAB6/src/exp6.cpp</w:t>
-      </w:r>
-      <w:r>
-        <w:rPr>
-          <w:rFonts w:ascii="Calibri" w:hAnsi="Calibri" w:eastAsia="宋体"/>
-          <w:sz w:val="22"/>
-        </w:rPr>
-        <w:br/>
-      </w:r>
-      <w:r>
-        <w:rPr>
-          <w:rFonts w:ascii="Courier New" w:hAnsi="Courier New" w:eastAsia="宋体"/>
-          <w:sz w:val="18"/>
-        </w:rPr>
-      </w:r>
-      <w:r>
-        <w:rPr>
-          <w:rFonts w:ascii="Calibri" w:hAnsi="Calibri" w:eastAsia="宋体"/>
-          <w:sz w:val="22"/>
-        </w:rPr>
-        <w:br/>
-      </w:r>
-      <w:r>
-        <w:rPr>
-          <w:rFonts w:ascii="Courier New" w:hAnsi="Courier New" w:eastAsia="宋体"/>
-          <w:sz w:val="18"/>
-        </w:rPr>
-        <w:t>(cd build &amp;&amp; ./exp6_raytracing.exe)</w:t>
-      </w:r>
-      <w:r>
-        <w:rPr>
-          <w:rFonts w:ascii="Calibri" w:hAnsi="Calibri" w:eastAsia="宋体"/>
-          <w:sz w:val="22"/>
-        </w:rPr>
-        <w:br/>
-      </w:r>
-      <w:r>
-        <w:rPr>
-          <w:rFonts w:ascii="Courier New" w:hAnsi="Courier New" w:eastAsia="宋体"/>
-          <w:sz w:val="18"/>
-        </w:rPr>
-        <w:t>cp build/exp6_raytracing.exe dist/</w:t>
-      </w:r>
-      <w:r>
-        <w:rPr>
-          <w:rFonts w:ascii="Calibri" w:hAnsi="Calibri" w:eastAsia="宋体"/>
-          <w:sz w:val="22"/>
-        </w:rPr>
-        <w:br/>
-      </w:r>
-      <w:r>
-        <w:rPr>
-          <w:rFonts w:ascii="Courier New" w:hAnsi="Courier New" w:eastAsia="宋体"/>
-          <w:sz w:val="18"/>
-        </w:rPr>
-        <w:t>cp build/output.ppm dist/exp6_output.ppm</w:t>
-      </w:r>
-    </w:p>
-    <w:p>
-      <w:pPr>
-        <w:spacing w:before="0" w:after="120" w:line="269" w:lineRule="auto"/>
-        <w:ind w:firstLine="418"/>
-      </w:pPr>
-      <w:r>
-        <w:rPr>
-          <w:rFonts w:ascii="Calibri" w:hAnsi="Calibri" w:eastAsia="宋体"/>
-          <w:sz w:val="22"/>
-        </w:rPr>
-        <w:t>最终提交包中包含源代码、实验报告、由程序生成的 output.ppm，以及从 GitHub Actions artifact 下载得到的 Windows 版 exp6_raytracing.exe。</w:t>
-      </w:r>
-    </w:p>
-    <w:p>
-      <w:r>
-        <w:br w:type="page"/>
-      </w:r>
-    </w:p>
-    <w:p>
-      <w:pPr>
-        <w:spacing w:before="200" w:after="120" w:line="269" w:lineRule="auto"/>
-      </w:pPr>
-      <w:r>
-        <w:rPr>
-          <w:rFonts w:ascii="Calibri" w:hAnsi="Calibri" w:eastAsia="宋体"/>
-          <w:b/>
-          <w:color w:val="1F4D78"/>
-          <w:sz w:val="28"/>
-        </w:rPr>
-        <w:t>六、实验总结</w:t>
-      </w:r>
-    </w:p>
-    <w:p>
-      <w:pPr>
-        <w:spacing w:before="0" w:after="120" w:line="269" w:lineRule="auto"/>
-        <w:ind w:firstLine="418"/>
-      </w:pPr>
-      <w:r>
-        <w:rPr>
-          <w:rFonts w:ascii="Calibri" w:hAnsi="Calibri" w:eastAsia="宋体"/>
-          <w:sz w:val="22"/>
-        </w:rPr>
-        <w:t>本次实验完成了 Ray Tracing 必做内容。光线生成部分解决了成像平面采样问题；阴影部分通过 shadow ray 判断光源可见性；反射和折射部分使用递归追踪扩展了单次局部光照模型，使场景能够表现镜面和透明材质。</w:t>
-      </w:r>
-    </w:p>
-    <w:p>
-      <w:pPr>
-        <w:spacing w:before="0" w:after="120" w:line="269" w:lineRule="auto"/>
-        <w:ind w:firstLine="418"/>
-      </w:pPr>
-      <w:r>
-        <w:rPr>
-          <w:rFonts w:ascii="Calibri" w:hAnsi="Calibri" w:eastAsia="宋体"/>
-          <w:sz w:val="22"/>
-        </w:rPr>
-        <w:t>通过本次实现，我进一步理解了光线跟踪相较于固定管线渲染的不同：每个像素颜色由从相机出发的光线路径决定，而阴影、反射和折射都可以统一表示为新的光线查询。递归深度、命中点偏移和距离判断是保证结果正确且稳定的重要细节。</w:t>
+        <w:t>图 1  实验6 Ray Tracing 运行结果截图</w:t>
       </w:r>
     </w:p>
     <w:sectPr>
@@ -999,7 +1103,7 @@
       <w:headerReference w:type="first" r:id="rId10"/>
       <w:footerReference w:type="first" r:id="rId11"/>
       <w:pgSz w:w="11906" w:h="16838"/>
-      <w:pgMar w:top="1368" w:right="1440" w:bottom="1368" w:left="1440" w:header="874" w:footer="991" w:gutter="0"/>
+      <w:pgMar w:top="1575" w:right="1736" w:bottom="2687" w:left="1800" w:header="874" w:footer="991" w:gutter="0"/>
       <w:cols w:space="720"/>
     </w:sectPr>
   </w:body>

</xml_diff>